<commit_message>
Added debounce and throttle and runzonedGuarded
</commit_message>
<xml_diff>
--- a/flutter_more_documents/f45_firebase_crashlytics_and_analytics_for_flutter.docx
+++ b/flutter_more_documents/f45_firebase_crashlytics_and_analytics_for_flutter.docx
@@ -4713,7 +4713,114 @@
           <w:sz w:val="32"/>
           <w:szCs w:val="32"/>
         </w:rPr>
-        <w:t># Captures:</w:t>
+        <w:t>#</w:t>
+      </w:r>
+      <w:r>
+        <w:rPr>
+          <w:sz w:val="32"/>
+          <w:szCs w:val="32"/>
+        </w:rPr>
+        <w:t xml:space="preserve"> </w:t>
+      </w:r>
+      <w:r>
+        <w:rPr>
+          <w:sz w:val="32"/>
+          <w:szCs w:val="32"/>
+        </w:rPr>
+        <w:t>Not every exception (error) can be caught with “</w:t>
+      </w:r>
+      <w:r>
+        <w:rPr>
+          <w:b/>
+          <w:bCs/>
+          <w:sz w:val="32"/>
+          <w:szCs w:val="32"/>
+        </w:rPr>
+        <w:t>try-catch</w:t>
+      </w:r>
+      <w:r>
+        <w:rPr>
+          <w:sz w:val="32"/>
+          <w:szCs w:val="32"/>
+        </w:rPr>
+        <w:t xml:space="preserve"> block” in everywhere,</w:t>
+      </w:r>
+      <w:r>
+        <w:rPr>
+          <w:b/>
+          <w:bCs/>
+          <w:sz w:val="32"/>
+          <w:szCs w:val="32"/>
+        </w:rPr>
+        <w:t xml:space="preserve"> Dart</w:t>
+      </w:r>
+      <w:r>
+        <w:rPr>
+          <w:sz w:val="32"/>
+          <w:szCs w:val="32"/>
+        </w:rPr>
+        <w:t xml:space="preserve"> zones help us catch all uncaught asynchronous errors (not handled by </w:t>
+      </w:r>
+      <w:r>
+        <w:rPr>
+          <w:b/>
+          <w:bCs/>
+          <w:sz w:val="32"/>
+          <w:szCs w:val="32"/>
+        </w:rPr>
+        <w:t>try-catch</w:t>
+      </w:r>
+      <w:r>
+        <w:rPr>
+          <w:sz w:val="32"/>
+          <w:szCs w:val="32"/>
+        </w:rPr>
+        <w:t xml:space="preserve">) in one centralized place. Using </w:t>
+      </w:r>
+      <w:proofErr w:type="spellStart"/>
+      <w:proofErr w:type="gramStart"/>
+      <w:r>
+        <w:rPr>
+          <w:b/>
+          <w:bCs/>
+          <w:sz w:val="32"/>
+          <w:szCs w:val="32"/>
+        </w:rPr>
+        <w:t>runZonedGuarded</w:t>
+      </w:r>
+      <w:proofErr w:type="spellEnd"/>
+      <w:r>
+        <w:rPr>
+          <w:b/>
+          <w:bCs/>
+          <w:sz w:val="32"/>
+          <w:szCs w:val="32"/>
+        </w:rPr>
+        <w:t>(</w:t>
+      </w:r>
+      <w:proofErr w:type="gramEnd"/>
+      <w:r>
+        <w:rPr>
+          <w:b/>
+          <w:bCs/>
+          <w:sz w:val="32"/>
+          <w:szCs w:val="32"/>
+        </w:rPr>
+        <w:t>)</w:t>
+      </w:r>
+      <w:r>
+        <w:rPr>
+          <w:sz w:val="32"/>
+          <w:szCs w:val="32"/>
+        </w:rPr>
+        <w:t>. It</w:t>
+      </w:r>
+      <w:r>
+        <w:rPr>
+          <w:sz w:val="32"/>
+          <w:szCs w:val="32"/>
+        </w:rPr>
+        <w:t xml:space="preserve"> Captures:</w:t>
       </w:r>
     </w:p>
     <w:p>
@@ -4927,6 +5034,7 @@
           <w:sz w:val="32"/>
           <w:szCs w:val="32"/>
         </w:rPr>
+        <w:lastRenderedPageBreak/>
         <w:t>PlatformDispatcher.onError</w:t>
       </w:r>
       <w:proofErr w:type="spellEnd"/>
@@ -5016,7 +5124,6 @@
           <w:sz w:val="32"/>
           <w:szCs w:val="32"/>
         </w:rPr>
-        <w:lastRenderedPageBreak/>
         <w:t xml:space="preserve">void </w:t>
       </w:r>
       <w:proofErr w:type="gramStart"/>
@@ -5511,6 +5618,7 @@
           <w:sz w:val="32"/>
           <w:szCs w:val="32"/>
         </w:rPr>
+        <w:lastRenderedPageBreak/>
         <w:t xml:space="preserve"> </w:t>
       </w:r>
     </w:p>
@@ -5660,7 +5768,6 @@
           <w:sz w:val="32"/>
           <w:szCs w:val="32"/>
         </w:rPr>
-        <w:lastRenderedPageBreak/>
         <w:t xml:space="preserve">void </w:t>
       </w:r>
       <w:proofErr w:type="gramStart"/>
@@ -6145,6 +6252,7 @@
           <w:sz w:val="32"/>
           <w:szCs w:val="32"/>
         </w:rPr>
+        <w:lastRenderedPageBreak/>
         <w:t>Wait 1–2 minutes</w:t>
       </w:r>
     </w:p>
@@ -6314,7 +6422,6 @@
           <w:sz w:val="32"/>
           <w:szCs w:val="32"/>
         </w:rPr>
-        <w:lastRenderedPageBreak/>
         <w:t xml:space="preserve">  },</w:t>
       </w:r>
     </w:p>
@@ -6745,6 +6852,7 @@
           <w:sz w:val="32"/>
           <w:szCs w:val="32"/>
         </w:rPr>
+        <w:lastRenderedPageBreak/>
         <w:t>}</w:t>
       </w:r>
     </w:p>
@@ -6829,7 +6937,6 @@
           <w:sz w:val="32"/>
           <w:szCs w:val="32"/>
         </w:rPr>
-        <w:lastRenderedPageBreak/>
         <w:t># When crash happens → logs appear in dashboard. This is HUGE in debugging production bugs.</w:t>
       </w:r>
     </w:p>
@@ -7213,6 +7320,7 @@
           <w:sz w:val="32"/>
           <w:szCs w:val="32"/>
         </w:rPr>
+        <w:lastRenderedPageBreak/>
         <w:t># By default, Crashlytics works in debug mode too.</w:t>
       </w:r>
     </w:p>
@@ -7298,7 +7406,6 @@
           <w:sz w:val="32"/>
           <w:szCs w:val="32"/>
         </w:rPr>
-        <w:lastRenderedPageBreak/>
         <w:t>In release → collection is enabled automatically</w:t>
       </w:r>
     </w:p>
@@ -7881,6 +7988,7 @@
           <w:sz w:val="32"/>
           <w:szCs w:val="32"/>
         </w:rPr>
+        <w:lastRenderedPageBreak/>
         <w:t xml:space="preserve">  </w:t>
       </w:r>
       <w:proofErr w:type="spellStart"/>
@@ -8441,6 +8549,7 @@
           <w:sz w:val="32"/>
           <w:szCs w:val="32"/>
         </w:rPr>
+        <w:lastRenderedPageBreak/>
         <w:t>Monitor Crashlytics daily</w:t>
       </w:r>
     </w:p>
@@ -8550,7 +8659,6 @@
           <w:sz w:val="32"/>
           <w:szCs w:val="32"/>
         </w:rPr>
-        <w:lastRenderedPageBreak/>
         <w:t>Crash-Free Users Metric:</w:t>
       </w:r>
     </w:p>
@@ -8940,6 +9048,7 @@
           <w:sz w:val="32"/>
           <w:szCs w:val="32"/>
         </w:rPr>
+        <w:lastRenderedPageBreak/>
         <w:t>Not waiting few minutes for dashboard update</w:t>
       </w:r>
     </w:p>
@@ -9028,7 +9137,6 @@
           <w:sz w:val="32"/>
           <w:szCs w:val="32"/>
         </w:rPr>
-        <w:lastRenderedPageBreak/>
         <w:t xml:space="preserve"># When releasing Android app, we must upload: </w:t>
       </w:r>
       <w:proofErr w:type="spellStart"/>
@@ -9415,6 +9523,7 @@
           <w:sz w:val="32"/>
           <w:szCs w:val="32"/>
         </w:rPr>
+        <w:lastRenderedPageBreak/>
         <w:t>mapping.txt</w:t>
       </w:r>
     </w:p>
@@ -9509,455 +9618,455 @@
           <w:sz w:val="32"/>
           <w:szCs w:val="32"/>
         </w:rPr>
+        <w:t># Without mapping: we are blind in production.</w:t>
+      </w:r>
+    </w:p>
+    <w:p>
+      <w:pPr>
+        <w:jc w:val="both"/>
+        <w:rPr>
+          <w:sz w:val="32"/>
+          <w:szCs w:val="32"/>
+        </w:rPr>
+      </w:pPr>
+    </w:p>
+    <w:p>
+      <w:pPr>
+        <w:jc w:val="both"/>
+        <w:rPr>
+          <w:sz w:val="32"/>
+          <w:szCs w:val="32"/>
+        </w:rPr>
+      </w:pPr>
+      <w:r>
+        <w:rPr>
+          <w:sz w:val="32"/>
+          <w:szCs w:val="32"/>
+        </w:rPr>
+        <w:t>Set up:</w:t>
+      </w:r>
+    </w:p>
+    <w:p>
+      <w:pPr>
+        <w:jc w:val="both"/>
+        <w:rPr>
+          <w:sz w:val="32"/>
+          <w:szCs w:val="32"/>
+        </w:rPr>
+      </w:pPr>
+      <w:r>
+        <w:rPr>
+          <w:sz w:val="32"/>
+          <w:szCs w:val="32"/>
+        </w:rPr>
+        <w:t xml:space="preserve"># For Enabling Mapping File Upload (VERY IMPORTANT) go to </w:t>
+      </w:r>
+      <w:proofErr w:type="spellStart"/>
+      <w:r>
+        <w:rPr>
+          <w:b/>
+          <w:bCs/>
+          <w:sz w:val="32"/>
+          <w:szCs w:val="32"/>
+        </w:rPr>
+        <w:t>project_root</w:t>
+      </w:r>
+      <w:proofErr w:type="spellEnd"/>
+      <w:r>
+        <w:rPr>
+          <w:b/>
+          <w:bCs/>
+          <w:sz w:val="32"/>
+          <w:szCs w:val="32"/>
+        </w:rPr>
+        <w:t>/android/app/</w:t>
+      </w:r>
+      <w:proofErr w:type="spellStart"/>
+      <w:r>
+        <w:rPr>
+          <w:b/>
+          <w:bCs/>
+          <w:sz w:val="32"/>
+          <w:szCs w:val="32"/>
+        </w:rPr>
+        <w:t>build.gradle.kts</w:t>
+      </w:r>
+      <w:proofErr w:type="spellEnd"/>
+      <w:r>
+        <w:rPr>
+          <w:sz w:val="32"/>
+          <w:szCs w:val="32"/>
+        </w:rPr>
+        <w:t xml:space="preserve"> and add these inside </w:t>
+      </w:r>
+      <w:r>
+        <w:rPr>
+          <w:b/>
+          <w:bCs/>
+          <w:sz w:val="32"/>
+          <w:szCs w:val="32"/>
+        </w:rPr>
+        <w:t>android {}</w:t>
+      </w:r>
+      <w:r>
+        <w:rPr>
+          <w:sz w:val="32"/>
+          <w:szCs w:val="32"/>
+        </w:rPr>
+        <w:t xml:space="preserve"> find </w:t>
+      </w:r>
+      <w:proofErr w:type="spellStart"/>
+      <w:r>
+        <w:rPr>
+          <w:b/>
+          <w:bCs/>
+          <w:sz w:val="32"/>
+          <w:szCs w:val="32"/>
+        </w:rPr>
+        <w:t>buildTypes</w:t>
+      </w:r>
+      <w:proofErr w:type="spellEnd"/>
+      <w:r>
+        <w:rPr>
+          <w:b/>
+          <w:bCs/>
+          <w:sz w:val="32"/>
+          <w:szCs w:val="32"/>
+        </w:rPr>
+        <w:t xml:space="preserve"> {}</w:t>
+      </w:r>
+      <w:r>
+        <w:rPr>
+          <w:sz w:val="32"/>
+          <w:szCs w:val="32"/>
+        </w:rPr>
+        <w:t xml:space="preserve"> and replace our </w:t>
+      </w:r>
+      <w:r>
+        <w:rPr>
+          <w:b/>
+          <w:bCs/>
+          <w:sz w:val="32"/>
+          <w:szCs w:val="32"/>
+        </w:rPr>
+        <w:t xml:space="preserve">release </w:t>
+      </w:r>
+      <w:r>
+        <w:rPr>
+          <w:sz w:val="32"/>
+          <w:szCs w:val="32"/>
+        </w:rPr>
+        <w:t>block with this</w:t>
+      </w:r>
+    </w:p>
+    <w:p>
+      <w:pPr>
+        <w:jc w:val="both"/>
+        <w:rPr>
+          <w:b/>
+          <w:bCs/>
+          <w:color w:val="D86DCB" w:themeColor="accent5" w:themeTint="99"/>
+          <w:sz w:val="32"/>
+          <w:szCs w:val="32"/>
+        </w:rPr>
+      </w:pPr>
+      <w:r>
+        <w:rPr>
+          <w:b/>
+          <w:bCs/>
+          <w:color w:val="D86DCB" w:themeColor="accent5" w:themeTint="99"/>
+          <w:sz w:val="32"/>
+          <w:szCs w:val="32"/>
+        </w:rPr>
+        <w:t>android {</w:t>
+      </w:r>
+    </w:p>
+    <w:p>
+      <w:pPr>
+        <w:jc w:val="both"/>
+        <w:rPr>
+          <w:b/>
+          <w:bCs/>
+          <w:color w:val="D86DCB" w:themeColor="accent5" w:themeTint="99"/>
+          <w:sz w:val="32"/>
+          <w:szCs w:val="32"/>
+        </w:rPr>
+      </w:pPr>
+      <w:r>
+        <w:rPr>
+          <w:b/>
+          <w:bCs/>
+          <w:color w:val="D86DCB" w:themeColor="accent5" w:themeTint="99"/>
+          <w:sz w:val="32"/>
+          <w:szCs w:val="32"/>
+        </w:rPr>
+        <w:t xml:space="preserve">    ...</w:t>
+      </w:r>
+    </w:p>
+    <w:p>
+      <w:pPr>
+        <w:jc w:val="both"/>
+        <w:rPr>
+          <w:b/>
+          <w:bCs/>
+          <w:color w:val="D86DCB" w:themeColor="accent5" w:themeTint="99"/>
+          <w:sz w:val="32"/>
+          <w:szCs w:val="32"/>
+        </w:rPr>
+      </w:pPr>
+      <w:r>
+        <w:rPr>
+          <w:b/>
+          <w:bCs/>
+          <w:color w:val="D86DCB" w:themeColor="accent5" w:themeTint="99"/>
+          <w:sz w:val="32"/>
+          <w:szCs w:val="32"/>
+        </w:rPr>
+        <w:t xml:space="preserve">    </w:t>
+      </w:r>
+      <w:proofErr w:type="spellStart"/>
+      <w:r>
+        <w:rPr>
+          <w:b/>
+          <w:bCs/>
+          <w:color w:val="D86DCB" w:themeColor="accent5" w:themeTint="99"/>
+          <w:sz w:val="32"/>
+          <w:szCs w:val="32"/>
+        </w:rPr>
+        <w:t>buildTypes</w:t>
+      </w:r>
+      <w:proofErr w:type="spellEnd"/>
+      <w:r>
+        <w:rPr>
+          <w:b/>
+          <w:bCs/>
+          <w:color w:val="D86DCB" w:themeColor="accent5" w:themeTint="99"/>
+          <w:sz w:val="32"/>
+          <w:szCs w:val="32"/>
+        </w:rPr>
+        <w:t xml:space="preserve"> {</w:t>
+      </w:r>
+    </w:p>
+    <w:p>
+      <w:pPr>
+        <w:jc w:val="both"/>
+        <w:rPr>
+          <w:b/>
+          <w:bCs/>
+          <w:color w:val="D86DCB" w:themeColor="accent5" w:themeTint="99"/>
+          <w:sz w:val="32"/>
+          <w:szCs w:val="32"/>
+        </w:rPr>
+      </w:pPr>
+    </w:p>
+    <w:p>
+      <w:pPr>
+        <w:jc w:val="both"/>
+        <w:rPr>
+          <w:b/>
+          <w:bCs/>
+          <w:color w:val="D86DCB" w:themeColor="accent5" w:themeTint="99"/>
+          <w:sz w:val="32"/>
+          <w:szCs w:val="32"/>
+        </w:rPr>
+      </w:pPr>
+      <w:r>
+        <w:rPr>
+          <w:b/>
+          <w:bCs/>
+          <w:color w:val="D86DCB" w:themeColor="accent5" w:themeTint="99"/>
+          <w:sz w:val="32"/>
+          <w:szCs w:val="32"/>
+        </w:rPr>
+        <w:t xml:space="preserve">        debug {</w:t>
+      </w:r>
+    </w:p>
+    <w:p>
+      <w:pPr>
+        <w:jc w:val="both"/>
+        <w:rPr>
+          <w:b/>
+          <w:bCs/>
+          <w:color w:val="D86DCB" w:themeColor="accent5" w:themeTint="99"/>
+          <w:sz w:val="32"/>
+          <w:szCs w:val="32"/>
+        </w:rPr>
+      </w:pPr>
+      <w:r>
+        <w:rPr>
+          <w:b/>
+          <w:bCs/>
+          <w:color w:val="D86DCB" w:themeColor="accent5" w:themeTint="99"/>
+          <w:sz w:val="32"/>
+          <w:szCs w:val="32"/>
+        </w:rPr>
+        <w:t xml:space="preserve">            // Debug builds normally don't shrink</w:t>
+      </w:r>
+    </w:p>
+    <w:p>
+      <w:pPr>
+        <w:jc w:val="both"/>
+        <w:rPr>
+          <w:b/>
+          <w:bCs/>
+          <w:color w:val="D86DCB" w:themeColor="accent5" w:themeTint="99"/>
+          <w:sz w:val="32"/>
+          <w:szCs w:val="32"/>
+        </w:rPr>
+      </w:pPr>
+      <w:r>
+        <w:rPr>
+          <w:b/>
+          <w:bCs/>
+          <w:color w:val="D86DCB" w:themeColor="accent5" w:themeTint="99"/>
+          <w:sz w:val="32"/>
+          <w:szCs w:val="32"/>
+        </w:rPr>
+        <w:t xml:space="preserve">            </w:t>
+      </w:r>
+      <w:proofErr w:type="spellStart"/>
+      <w:r>
+        <w:rPr>
+          <w:b/>
+          <w:bCs/>
+          <w:color w:val="D86DCB" w:themeColor="accent5" w:themeTint="99"/>
+          <w:sz w:val="32"/>
+          <w:szCs w:val="32"/>
+        </w:rPr>
+        <w:t>minifyEnabled</w:t>
+      </w:r>
+      <w:proofErr w:type="spellEnd"/>
+      <w:r>
+        <w:rPr>
+          <w:b/>
+          <w:bCs/>
+          <w:color w:val="D86DCB" w:themeColor="accent5" w:themeTint="99"/>
+          <w:sz w:val="32"/>
+          <w:szCs w:val="32"/>
+        </w:rPr>
+        <w:t xml:space="preserve"> false</w:t>
+      </w:r>
+    </w:p>
+    <w:p>
+      <w:pPr>
+        <w:jc w:val="both"/>
+        <w:rPr>
+          <w:b/>
+          <w:bCs/>
+          <w:color w:val="D86DCB" w:themeColor="accent5" w:themeTint="99"/>
+          <w:sz w:val="32"/>
+          <w:szCs w:val="32"/>
+        </w:rPr>
+      </w:pPr>
+      <w:r>
+        <w:rPr>
+          <w:b/>
+          <w:bCs/>
+          <w:color w:val="D86DCB" w:themeColor="accent5" w:themeTint="99"/>
+          <w:sz w:val="32"/>
+          <w:szCs w:val="32"/>
+        </w:rPr>
+        <w:t xml:space="preserve">            </w:t>
+      </w:r>
+      <w:proofErr w:type="spellStart"/>
+      <w:r>
+        <w:rPr>
+          <w:b/>
+          <w:bCs/>
+          <w:color w:val="D86DCB" w:themeColor="accent5" w:themeTint="99"/>
+          <w:sz w:val="32"/>
+          <w:szCs w:val="32"/>
+        </w:rPr>
+        <w:t>shrinkResources</w:t>
+      </w:r>
+      <w:proofErr w:type="spellEnd"/>
+      <w:r>
+        <w:rPr>
+          <w:b/>
+          <w:bCs/>
+          <w:color w:val="D86DCB" w:themeColor="accent5" w:themeTint="99"/>
+          <w:sz w:val="32"/>
+          <w:szCs w:val="32"/>
+        </w:rPr>
+        <w:t xml:space="preserve"> false</w:t>
+      </w:r>
+    </w:p>
+    <w:p>
+      <w:pPr>
+        <w:jc w:val="both"/>
+        <w:rPr>
+          <w:b/>
+          <w:bCs/>
+          <w:color w:val="D86DCB" w:themeColor="accent5" w:themeTint="99"/>
+          <w:sz w:val="32"/>
+          <w:szCs w:val="32"/>
+        </w:rPr>
+      </w:pPr>
+      <w:r>
+        <w:rPr>
+          <w:b/>
+          <w:bCs/>
+          <w:color w:val="D86DCB" w:themeColor="accent5" w:themeTint="99"/>
+          <w:sz w:val="32"/>
+          <w:szCs w:val="32"/>
+        </w:rPr>
+        <w:t xml:space="preserve">        }</w:t>
+      </w:r>
+    </w:p>
+    <w:p>
+      <w:pPr>
+        <w:jc w:val="both"/>
+        <w:rPr>
+          <w:b/>
+          <w:bCs/>
+          <w:color w:val="D86DCB" w:themeColor="accent5" w:themeTint="99"/>
+          <w:sz w:val="32"/>
+          <w:szCs w:val="32"/>
+        </w:rPr>
+      </w:pPr>
+    </w:p>
+    <w:p>
+      <w:pPr>
+        <w:jc w:val="both"/>
+        <w:rPr>
+          <w:b/>
+          <w:bCs/>
+          <w:color w:val="D86DCB" w:themeColor="accent5" w:themeTint="99"/>
+          <w:sz w:val="32"/>
+          <w:szCs w:val="32"/>
+        </w:rPr>
+      </w:pPr>
+      <w:r>
+        <w:rPr>
+          <w:b/>
+          <w:bCs/>
+          <w:color w:val="D86DCB" w:themeColor="accent5" w:themeTint="99"/>
+          <w:sz w:val="32"/>
+          <w:szCs w:val="32"/>
+        </w:rPr>
+        <w:t xml:space="preserve">        release {</w:t>
+      </w:r>
+    </w:p>
+    <w:p>
+      <w:pPr>
+        <w:jc w:val="both"/>
+        <w:rPr>
+          <w:b/>
+          <w:bCs/>
+          <w:color w:val="D86DCB" w:themeColor="accent5" w:themeTint="99"/>
+          <w:sz w:val="32"/>
+          <w:szCs w:val="32"/>
+        </w:rPr>
+      </w:pPr>
+      <w:r>
+        <w:rPr>
+          <w:b/>
+          <w:bCs/>
+          <w:color w:val="D86DCB" w:themeColor="accent5" w:themeTint="99"/>
+          <w:sz w:val="32"/>
+          <w:szCs w:val="32"/>
+        </w:rPr>
         <w:lastRenderedPageBreak/>
-        <w:t># Without mapping: we are blind in production.</w:t>
-      </w:r>
-    </w:p>
-    <w:p>
-      <w:pPr>
-        <w:jc w:val="both"/>
-        <w:rPr>
-          <w:sz w:val="32"/>
-          <w:szCs w:val="32"/>
-        </w:rPr>
-      </w:pPr>
-    </w:p>
-    <w:p>
-      <w:pPr>
-        <w:jc w:val="both"/>
-        <w:rPr>
-          <w:sz w:val="32"/>
-          <w:szCs w:val="32"/>
-        </w:rPr>
-      </w:pPr>
-      <w:r>
-        <w:rPr>
-          <w:sz w:val="32"/>
-          <w:szCs w:val="32"/>
-        </w:rPr>
-        <w:t>Set up:</w:t>
-      </w:r>
-    </w:p>
-    <w:p>
-      <w:pPr>
-        <w:jc w:val="both"/>
-        <w:rPr>
-          <w:sz w:val="32"/>
-          <w:szCs w:val="32"/>
-        </w:rPr>
-      </w:pPr>
-      <w:r>
-        <w:rPr>
-          <w:sz w:val="32"/>
-          <w:szCs w:val="32"/>
-        </w:rPr>
-        <w:t xml:space="preserve"># For Enabling Mapping File Upload (VERY IMPORTANT) go to </w:t>
-      </w:r>
-      <w:proofErr w:type="spellStart"/>
-      <w:r>
-        <w:rPr>
-          <w:b/>
-          <w:bCs/>
-          <w:sz w:val="32"/>
-          <w:szCs w:val="32"/>
-        </w:rPr>
-        <w:t>project_root</w:t>
-      </w:r>
-      <w:proofErr w:type="spellEnd"/>
-      <w:r>
-        <w:rPr>
-          <w:b/>
-          <w:bCs/>
-          <w:sz w:val="32"/>
-          <w:szCs w:val="32"/>
-        </w:rPr>
-        <w:t>/android/app/</w:t>
-      </w:r>
-      <w:proofErr w:type="spellStart"/>
-      <w:r>
-        <w:rPr>
-          <w:b/>
-          <w:bCs/>
-          <w:sz w:val="32"/>
-          <w:szCs w:val="32"/>
-        </w:rPr>
-        <w:t>build.gradle.kts</w:t>
-      </w:r>
-      <w:proofErr w:type="spellEnd"/>
-      <w:r>
-        <w:rPr>
-          <w:sz w:val="32"/>
-          <w:szCs w:val="32"/>
-        </w:rPr>
-        <w:t xml:space="preserve"> and add these inside </w:t>
-      </w:r>
-      <w:r>
-        <w:rPr>
-          <w:b/>
-          <w:bCs/>
-          <w:sz w:val="32"/>
-          <w:szCs w:val="32"/>
-        </w:rPr>
-        <w:t>android {}</w:t>
-      </w:r>
-      <w:r>
-        <w:rPr>
-          <w:sz w:val="32"/>
-          <w:szCs w:val="32"/>
-        </w:rPr>
-        <w:t xml:space="preserve"> find </w:t>
-      </w:r>
-      <w:proofErr w:type="spellStart"/>
-      <w:r>
-        <w:rPr>
-          <w:b/>
-          <w:bCs/>
-          <w:sz w:val="32"/>
-          <w:szCs w:val="32"/>
-        </w:rPr>
-        <w:t>buildTypes</w:t>
-      </w:r>
-      <w:proofErr w:type="spellEnd"/>
-      <w:r>
-        <w:rPr>
-          <w:b/>
-          <w:bCs/>
-          <w:sz w:val="32"/>
-          <w:szCs w:val="32"/>
-        </w:rPr>
-        <w:t xml:space="preserve"> {}</w:t>
-      </w:r>
-      <w:r>
-        <w:rPr>
-          <w:sz w:val="32"/>
-          <w:szCs w:val="32"/>
-        </w:rPr>
-        <w:t xml:space="preserve"> and replace our </w:t>
-      </w:r>
-      <w:r>
-        <w:rPr>
-          <w:b/>
-          <w:bCs/>
-          <w:sz w:val="32"/>
-          <w:szCs w:val="32"/>
-        </w:rPr>
-        <w:t xml:space="preserve">release </w:t>
-      </w:r>
-      <w:r>
-        <w:rPr>
-          <w:sz w:val="32"/>
-          <w:szCs w:val="32"/>
-        </w:rPr>
-        <w:t>block with this</w:t>
-      </w:r>
-    </w:p>
-    <w:p>
-      <w:pPr>
-        <w:jc w:val="both"/>
-        <w:rPr>
-          <w:b/>
-          <w:bCs/>
-          <w:color w:val="D86DCB" w:themeColor="accent5" w:themeTint="99"/>
-          <w:sz w:val="32"/>
-          <w:szCs w:val="32"/>
-        </w:rPr>
-      </w:pPr>
-      <w:r>
-        <w:rPr>
-          <w:b/>
-          <w:bCs/>
-          <w:color w:val="D86DCB" w:themeColor="accent5" w:themeTint="99"/>
-          <w:sz w:val="32"/>
-          <w:szCs w:val="32"/>
-        </w:rPr>
-        <w:t>android {</w:t>
-      </w:r>
-    </w:p>
-    <w:p>
-      <w:pPr>
-        <w:jc w:val="both"/>
-        <w:rPr>
-          <w:b/>
-          <w:bCs/>
-          <w:color w:val="D86DCB" w:themeColor="accent5" w:themeTint="99"/>
-          <w:sz w:val="32"/>
-          <w:szCs w:val="32"/>
-        </w:rPr>
-      </w:pPr>
-      <w:r>
-        <w:rPr>
-          <w:b/>
-          <w:bCs/>
-          <w:color w:val="D86DCB" w:themeColor="accent5" w:themeTint="99"/>
-          <w:sz w:val="32"/>
-          <w:szCs w:val="32"/>
-        </w:rPr>
-        <w:t xml:space="preserve">    ...</w:t>
-      </w:r>
-    </w:p>
-    <w:p>
-      <w:pPr>
-        <w:jc w:val="both"/>
-        <w:rPr>
-          <w:b/>
-          <w:bCs/>
-          <w:color w:val="D86DCB" w:themeColor="accent5" w:themeTint="99"/>
-          <w:sz w:val="32"/>
-          <w:szCs w:val="32"/>
-        </w:rPr>
-      </w:pPr>
-      <w:r>
-        <w:rPr>
-          <w:b/>
-          <w:bCs/>
-          <w:color w:val="D86DCB" w:themeColor="accent5" w:themeTint="99"/>
-          <w:sz w:val="32"/>
-          <w:szCs w:val="32"/>
-        </w:rPr>
-        <w:t xml:space="preserve">    </w:t>
-      </w:r>
-      <w:proofErr w:type="spellStart"/>
-      <w:r>
-        <w:rPr>
-          <w:b/>
-          <w:bCs/>
-          <w:color w:val="D86DCB" w:themeColor="accent5" w:themeTint="99"/>
-          <w:sz w:val="32"/>
-          <w:szCs w:val="32"/>
-        </w:rPr>
-        <w:t>buildTypes</w:t>
-      </w:r>
-      <w:proofErr w:type="spellEnd"/>
-      <w:r>
-        <w:rPr>
-          <w:b/>
-          <w:bCs/>
-          <w:color w:val="D86DCB" w:themeColor="accent5" w:themeTint="99"/>
-          <w:sz w:val="32"/>
-          <w:szCs w:val="32"/>
-        </w:rPr>
-        <w:t xml:space="preserve"> {</w:t>
-      </w:r>
-    </w:p>
-    <w:p>
-      <w:pPr>
-        <w:jc w:val="both"/>
-        <w:rPr>
-          <w:b/>
-          <w:bCs/>
-          <w:color w:val="D86DCB" w:themeColor="accent5" w:themeTint="99"/>
-          <w:sz w:val="32"/>
-          <w:szCs w:val="32"/>
-        </w:rPr>
-      </w:pPr>
-    </w:p>
-    <w:p>
-      <w:pPr>
-        <w:jc w:val="both"/>
-        <w:rPr>
-          <w:b/>
-          <w:bCs/>
-          <w:color w:val="D86DCB" w:themeColor="accent5" w:themeTint="99"/>
-          <w:sz w:val="32"/>
-          <w:szCs w:val="32"/>
-        </w:rPr>
-      </w:pPr>
-      <w:r>
-        <w:rPr>
-          <w:b/>
-          <w:bCs/>
-          <w:color w:val="D86DCB" w:themeColor="accent5" w:themeTint="99"/>
-          <w:sz w:val="32"/>
-          <w:szCs w:val="32"/>
-        </w:rPr>
-        <w:t xml:space="preserve">        debug {</w:t>
-      </w:r>
-    </w:p>
-    <w:p>
-      <w:pPr>
-        <w:jc w:val="both"/>
-        <w:rPr>
-          <w:b/>
-          <w:bCs/>
-          <w:color w:val="D86DCB" w:themeColor="accent5" w:themeTint="99"/>
-          <w:sz w:val="32"/>
-          <w:szCs w:val="32"/>
-        </w:rPr>
-      </w:pPr>
-      <w:r>
-        <w:rPr>
-          <w:b/>
-          <w:bCs/>
-          <w:color w:val="D86DCB" w:themeColor="accent5" w:themeTint="99"/>
-          <w:sz w:val="32"/>
-          <w:szCs w:val="32"/>
-        </w:rPr>
-        <w:t xml:space="preserve">            // Debug builds normally don't shrink</w:t>
-      </w:r>
-    </w:p>
-    <w:p>
-      <w:pPr>
-        <w:jc w:val="both"/>
-        <w:rPr>
-          <w:b/>
-          <w:bCs/>
-          <w:color w:val="D86DCB" w:themeColor="accent5" w:themeTint="99"/>
-          <w:sz w:val="32"/>
-          <w:szCs w:val="32"/>
-        </w:rPr>
-      </w:pPr>
-      <w:r>
-        <w:rPr>
-          <w:b/>
-          <w:bCs/>
-          <w:color w:val="D86DCB" w:themeColor="accent5" w:themeTint="99"/>
-          <w:sz w:val="32"/>
-          <w:szCs w:val="32"/>
-        </w:rPr>
-        <w:t xml:space="preserve">            </w:t>
-      </w:r>
-      <w:proofErr w:type="spellStart"/>
-      <w:r>
-        <w:rPr>
-          <w:b/>
-          <w:bCs/>
-          <w:color w:val="D86DCB" w:themeColor="accent5" w:themeTint="99"/>
-          <w:sz w:val="32"/>
-          <w:szCs w:val="32"/>
-        </w:rPr>
-        <w:t>minifyEnabled</w:t>
-      </w:r>
-      <w:proofErr w:type="spellEnd"/>
-      <w:r>
-        <w:rPr>
-          <w:b/>
-          <w:bCs/>
-          <w:color w:val="D86DCB" w:themeColor="accent5" w:themeTint="99"/>
-          <w:sz w:val="32"/>
-          <w:szCs w:val="32"/>
-        </w:rPr>
-        <w:t xml:space="preserve"> false</w:t>
-      </w:r>
-    </w:p>
-    <w:p>
-      <w:pPr>
-        <w:jc w:val="both"/>
-        <w:rPr>
-          <w:b/>
-          <w:bCs/>
-          <w:color w:val="D86DCB" w:themeColor="accent5" w:themeTint="99"/>
-          <w:sz w:val="32"/>
-          <w:szCs w:val="32"/>
-        </w:rPr>
-      </w:pPr>
-      <w:r>
-        <w:rPr>
-          <w:b/>
-          <w:bCs/>
-          <w:color w:val="D86DCB" w:themeColor="accent5" w:themeTint="99"/>
-          <w:sz w:val="32"/>
-          <w:szCs w:val="32"/>
-        </w:rPr>
-        <w:t xml:space="preserve">            </w:t>
-      </w:r>
-      <w:proofErr w:type="spellStart"/>
-      <w:r>
-        <w:rPr>
-          <w:b/>
-          <w:bCs/>
-          <w:color w:val="D86DCB" w:themeColor="accent5" w:themeTint="99"/>
-          <w:sz w:val="32"/>
-          <w:szCs w:val="32"/>
-        </w:rPr>
-        <w:t>shrinkResources</w:t>
-      </w:r>
-      <w:proofErr w:type="spellEnd"/>
-      <w:r>
-        <w:rPr>
-          <w:b/>
-          <w:bCs/>
-          <w:color w:val="D86DCB" w:themeColor="accent5" w:themeTint="99"/>
-          <w:sz w:val="32"/>
-          <w:szCs w:val="32"/>
-        </w:rPr>
-        <w:t xml:space="preserve"> false</w:t>
-      </w:r>
-    </w:p>
-    <w:p>
-      <w:pPr>
-        <w:jc w:val="both"/>
-        <w:rPr>
-          <w:b/>
-          <w:bCs/>
-          <w:color w:val="D86DCB" w:themeColor="accent5" w:themeTint="99"/>
-          <w:sz w:val="32"/>
-          <w:szCs w:val="32"/>
-        </w:rPr>
-      </w:pPr>
-      <w:r>
-        <w:rPr>
-          <w:b/>
-          <w:bCs/>
-          <w:color w:val="D86DCB" w:themeColor="accent5" w:themeTint="99"/>
-          <w:sz w:val="32"/>
-          <w:szCs w:val="32"/>
-        </w:rPr>
-        <w:t xml:space="preserve">        }</w:t>
-      </w:r>
-    </w:p>
-    <w:p>
-      <w:pPr>
-        <w:jc w:val="both"/>
-        <w:rPr>
-          <w:b/>
-          <w:bCs/>
-          <w:color w:val="D86DCB" w:themeColor="accent5" w:themeTint="99"/>
-          <w:sz w:val="32"/>
-          <w:szCs w:val="32"/>
-        </w:rPr>
-      </w:pPr>
-    </w:p>
-    <w:p>
-      <w:pPr>
-        <w:jc w:val="both"/>
-        <w:rPr>
-          <w:b/>
-          <w:bCs/>
-          <w:color w:val="D86DCB" w:themeColor="accent5" w:themeTint="99"/>
-          <w:sz w:val="32"/>
-          <w:szCs w:val="32"/>
-        </w:rPr>
-      </w:pPr>
-      <w:r>
-        <w:rPr>
-          <w:b/>
-          <w:bCs/>
-          <w:color w:val="D86DCB" w:themeColor="accent5" w:themeTint="99"/>
-          <w:sz w:val="32"/>
-          <w:szCs w:val="32"/>
-        </w:rPr>
-        <w:t xml:space="preserve">        release {</w:t>
-      </w:r>
-    </w:p>
-    <w:p>
-      <w:pPr>
-        <w:jc w:val="both"/>
-        <w:rPr>
-          <w:b/>
-          <w:bCs/>
-          <w:color w:val="D86DCB" w:themeColor="accent5" w:themeTint="99"/>
-          <w:sz w:val="32"/>
-          <w:szCs w:val="32"/>
-        </w:rPr>
-      </w:pPr>
-      <w:r>
-        <w:rPr>
-          <w:b/>
-          <w:bCs/>
-          <w:color w:val="D86DCB" w:themeColor="accent5" w:themeTint="99"/>
-          <w:sz w:val="32"/>
-          <w:szCs w:val="32"/>
-        </w:rPr>
         <w:t xml:space="preserve">            // Enable code shrinking (R8)</w:t>
       </w:r>
     </w:p>
@@ -10576,6 +10685,7 @@
           <w:sz w:val="32"/>
           <w:szCs w:val="32"/>
         </w:rPr>
+        <w:lastRenderedPageBreak/>
         <w:t>No mapping file generated</w:t>
       </w:r>
     </w:p>
@@ -10671,7 +10781,6 @@
           <w:sz w:val="32"/>
           <w:szCs w:val="32"/>
         </w:rPr>
-        <w:lastRenderedPageBreak/>
         <w:t xml:space="preserve"># </w:t>
       </w:r>
       <w:proofErr w:type="spellStart"/>
@@ -11147,6 +11256,7 @@
           <w:sz w:val="32"/>
           <w:szCs w:val="32"/>
         </w:rPr>
+        <w:lastRenderedPageBreak/>
         <w:t># If we don’t see this → mapping upload is NOT happening.</w:t>
       </w:r>
     </w:p>
@@ -11259,7 +11369,6 @@
           <w:sz w:val="32"/>
           <w:szCs w:val="32"/>
         </w:rPr>
-        <w:lastRenderedPageBreak/>
         <w:t xml:space="preserve">    id '</w:t>
       </w:r>
       <w:proofErr w:type="spellStart"/>
@@ -11755,6 +11864,7 @@
           <w:sz w:val="32"/>
           <w:szCs w:val="32"/>
         </w:rPr>
+        <w:lastRenderedPageBreak/>
         <w:t># Do we need mapping file in debug? No.</w:t>
       </w:r>
     </w:p>
@@ -11834,7 +11944,6 @@
           <w:sz w:val="32"/>
           <w:szCs w:val="32"/>
         </w:rPr>
-        <w:lastRenderedPageBreak/>
         <w:t># But in Play Store release build? Without mapping, our stack trace becomes:</w:t>
       </w:r>
     </w:p>
@@ -12472,7 +12581,6 @@
           <w:sz w:val="32"/>
           <w:szCs w:val="32"/>
         </w:rPr>
-        <w:lastRenderedPageBreak/>
         <w:t>No custom Gradle skipping tasks</w:t>
       </w:r>
     </w:p>
@@ -12813,6 +12921,7 @@
           <w:sz w:val="32"/>
           <w:szCs w:val="32"/>
         </w:rPr>
+        <w:lastRenderedPageBreak/>
         <w:t># Without writing a single line of tracking code. But that’s not useful for product analytics. We must log custom events.</w:t>
       </w:r>
     </w:p>
@@ -12854,7 +12963,6 @@
           <w:sz w:val="32"/>
           <w:szCs w:val="32"/>
         </w:rPr>
-        <w:lastRenderedPageBreak/>
         <w:t xml:space="preserve"># First setup </w:t>
       </w:r>
       <w:r>
@@ -13377,6 +13485,7 @@
           <w:sz w:val="32"/>
           <w:szCs w:val="32"/>
         </w:rPr>
+        <w:lastRenderedPageBreak/>
         <w:t>android {</w:t>
       </w:r>
     </w:p>
@@ -13465,7 +13574,6 @@
           <w:sz w:val="32"/>
           <w:szCs w:val="32"/>
         </w:rPr>
-        <w:lastRenderedPageBreak/>
         <w:t xml:space="preserve">    // Import the BoM for the Firebase platform</w:t>
       </w:r>
     </w:p>
@@ -13991,6 +14099,7 @@
           <w:sz w:val="32"/>
           <w:szCs w:val="32"/>
         </w:rPr>
+        <w:lastRenderedPageBreak/>
         <w:t xml:space="preserve">  name: '</w:t>
       </w:r>
       <w:proofErr w:type="spellStart"/>
@@ -14101,7 +14210,6 @@
           <w:sz w:val="32"/>
           <w:szCs w:val="32"/>
         </w:rPr>
-        <w:lastRenderedPageBreak/>
         <w:t>);</w:t>
       </w:r>
     </w:p>
@@ -14178,17 +14286,7 @@
           <w:sz w:val="32"/>
           <w:szCs w:val="32"/>
         </w:rPr>
-        <w:t xml:space="preserve">  </w:t>
-      </w:r>
-      <w:r>
-        <w:rPr>
-          <w:b/>
-          <w:bCs/>
-          <w:color w:val="D86DCB" w:themeColor="accent5" w:themeTint="99"/>
-          <w:sz w:val="32"/>
-          <w:szCs w:val="32"/>
-        </w:rPr>
-        <w:t xml:space="preserve">final analytics = </w:t>
+        <w:t xml:space="preserve">  final analytics = </w:t>
       </w:r>
       <w:proofErr w:type="spellStart"/>
       <w:r>
@@ -14302,27 +14400,7 @@
           <w:sz w:val="32"/>
           <w:szCs w:val="32"/>
         </w:rPr>
-        <w:t>(</w:t>
-      </w:r>
-      <w:r>
-        <w:rPr>
-          <w:b/>
-          <w:bCs/>
-          <w:color w:val="D86DCB" w:themeColor="accent5" w:themeTint="99"/>
-          <w:sz w:val="32"/>
-          <w:szCs w:val="32"/>
-        </w:rPr>
-        <w:t>…)</w:t>
-      </w:r>
-      <w:r>
-        <w:rPr>
-          <w:b/>
-          <w:bCs/>
-          <w:color w:val="D86DCB" w:themeColor="accent5" w:themeTint="99"/>
-          <w:sz w:val="32"/>
-          <w:szCs w:val="32"/>
-        </w:rPr>
-        <w:t>;</w:t>
+        <w:t>(…);</w:t>
       </w:r>
     </w:p>
     <w:p>
@@ -14679,6 +14757,7 @@
           <w:sz w:val="32"/>
           <w:szCs w:val="32"/>
         </w:rPr>
+        <w:lastRenderedPageBreak/>
         <w:t xml:space="preserve">    );</w:t>
       </w:r>
     </w:p>
@@ -15412,6 +15491,7 @@
           <w:sz w:val="32"/>
           <w:szCs w:val="32"/>
         </w:rPr>
+        <w:lastRenderedPageBreak/>
         <w:t xml:space="preserve">    </w:t>
       </w:r>
       <w:proofErr w:type="spellStart"/>
@@ -15534,7 +15614,6 @@
           <w:sz w:val="32"/>
           <w:szCs w:val="32"/>
         </w:rPr>
-        <w:lastRenderedPageBreak/>
         <w:t>)</w:t>
       </w:r>
     </w:p>
@@ -15873,6 +15952,7 @@
           <w:sz w:val="32"/>
           <w:szCs w:val="32"/>
         </w:rPr>
+        <w:lastRenderedPageBreak/>
         <w:t>Device identifiers</w:t>
       </w:r>
     </w:p>
@@ -15945,7 +16025,6 @@
           <w:sz w:val="32"/>
           <w:szCs w:val="32"/>
         </w:rPr>
-        <w:lastRenderedPageBreak/>
         <w:t xml:space="preserve">    </w:t>
       </w:r>
       <w:proofErr w:type="gramStart"/>
@@ -16043,16 +16122,7 @@
           <w:sz w:val="32"/>
           <w:szCs w:val="32"/>
         </w:rPr>
-        <w:t xml:space="preserve"> Setup</w:t>
-      </w:r>
-      <w:r>
-        <w:rPr>
-          <w:b/>
-          <w:bCs/>
-          <w:sz w:val="32"/>
-          <w:szCs w:val="32"/>
-        </w:rPr>
-        <w:t xml:space="preserve"> of </w:t>
+        <w:t xml:space="preserve"> Setup of </w:t>
       </w:r>
       <w:r>
         <w:rPr>
@@ -16530,6 +16600,7 @@
           <w:sz w:val="32"/>
           <w:szCs w:val="32"/>
         </w:rPr>
+        <w:lastRenderedPageBreak/>
         <w:t xml:space="preserve">  await </w:t>
       </w:r>
       <w:proofErr w:type="spellStart"/>
@@ -16686,7 +16757,6 @@
           <w:sz w:val="32"/>
           <w:szCs w:val="32"/>
         </w:rPr>
-        <w:lastRenderedPageBreak/>
         <w:t xml:space="preserve">  await </w:t>
       </w:r>
       <w:proofErr w:type="spellStart"/>
@@ -16940,14 +17010,7 @@
           <w:sz w:val="32"/>
           <w:szCs w:val="32"/>
         </w:rPr>
-        <w:t>#</w:t>
-      </w:r>
-      <w:r>
-        <w:rPr>
-          <w:sz w:val="32"/>
-          <w:szCs w:val="32"/>
-        </w:rPr>
-        <w:t xml:space="preserve"> Setup, first go to </w:t>
+        <w:t xml:space="preserve"># Setup, first go to </w:t>
       </w:r>
       <w:r>
         <w:rPr>
@@ -17184,6 +17247,7 @@
           <w:sz w:val="32"/>
           <w:szCs w:val="32"/>
         </w:rPr>
+        <w:lastRenderedPageBreak/>
         <w:t>Custom Event for Firebase Analytics:</w:t>
       </w:r>
     </w:p>
@@ -17293,7 +17357,6 @@
           <w:sz w:val="32"/>
           <w:szCs w:val="32"/>
         </w:rPr>
-        <w:lastRenderedPageBreak/>
         <w:t>Someone downloaded our résumé.</w:t>
       </w:r>
     </w:p>
@@ -17697,6 +17760,7 @@
           <w:sz w:val="28"/>
           <w:szCs w:val="28"/>
         </w:rPr>
+        <w:lastRenderedPageBreak/>
         <w:t>resume_downloaded</w:t>
       </w:r>
       <w:proofErr w:type="spellEnd"/>
@@ -17769,7 +17833,6 @@
           <w:sz w:val="28"/>
           <w:szCs w:val="28"/>
         </w:rPr>
-        <w:lastRenderedPageBreak/>
         <w:t>Custom event:</w:t>
       </w:r>
     </w:p>
@@ -18381,6 +18444,7 @@
           <w:sz w:val="28"/>
           <w:szCs w:val="28"/>
         </w:rPr>
+        <w:lastRenderedPageBreak/>
         <w:t>Action:</w:t>
       </w:r>
     </w:p>
@@ -18519,7 +18583,6 @@
           <w:sz w:val="28"/>
           <w:szCs w:val="28"/>
         </w:rPr>
-        <w:lastRenderedPageBreak/>
         <w:t>t</w:t>
       </w:r>
       <w:r>
@@ -19260,6 +19323,7 @@
           <w:sz w:val="32"/>
           <w:szCs w:val="32"/>
         </w:rPr>
+        <w:lastRenderedPageBreak/>
         <w:t>});</w:t>
       </w:r>
     </w:p>
@@ -19322,7 +19386,6 @@
                 <w:sz w:val="32"/>
                 <w:szCs w:val="32"/>
               </w:rPr>
-              <w:lastRenderedPageBreak/>
               <w:t>Event</w:t>
             </w:r>
           </w:p>
@@ -19993,6 +20056,7 @@
           <w:sz w:val="32"/>
           <w:szCs w:val="32"/>
         </w:rPr>
+        <w:lastRenderedPageBreak/>
         <w:t>weather_clicked</w:t>
       </w:r>
       <w:proofErr w:type="spellEnd"/>
@@ -20101,7 +20165,6 @@
           <w:sz w:val="32"/>
           <w:szCs w:val="32"/>
         </w:rPr>
-        <w:lastRenderedPageBreak/>
         <w:t>event_finder_clicked</w:t>
       </w:r>
       <w:proofErr w:type="spellEnd"/>
@@ -20624,6 +20687,7 @@
           <w:sz w:val="32"/>
           <w:szCs w:val="32"/>
         </w:rPr>
+        <w:lastRenderedPageBreak/>
         <w:t xml:space="preserve">    '</w:t>
       </w:r>
       <w:proofErr w:type="spellStart"/>
@@ -20724,7 +20788,6 @@
           <w:sz w:val="32"/>
           <w:szCs w:val="32"/>
         </w:rPr>
-        <w:lastRenderedPageBreak/>
         <w:t>);</w:t>
       </w:r>
     </w:p>
@@ -21402,6 +21465,7 @@
           <w:sz w:val="32"/>
           <w:szCs w:val="32"/>
         </w:rPr>
+        <w:lastRenderedPageBreak/>
         <w:t xml:space="preserve"># </w:t>
       </w:r>
       <w:r>
@@ -21511,7 +21575,6 @@
           <w:sz w:val="32"/>
           <w:szCs w:val="32"/>
         </w:rPr>
-        <w:lastRenderedPageBreak/>
         <w:t>Break</w:t>
       </w:r>
     </w:p>
@@ -21881,6 +21944,7 @@
           <w:sz w:val="28"/>
           <w:szCs w:val="28"/>
         </w:rPr>
+        <w:lastRenderedPageBreak/>
         <w:t>Device = Desktop</w:t>
       </w:r>
     </w:p>
@@ -21971,7 +22035,6 @@
           <w:sz w:val="28"/>
           <w:szCs w:val="28"/>
         </w:rPr>
-        <w:lastRenderedPageBreak/>
         <w:t>Device = Mobile</w:t>
       </w:r>
     </w:p>
@@ -22448,6 +22511,7 @@
           <w:sz w:val="32"/>
           <w:szCs w:val="32"/>
         </w:rPr>
+        <w:lastRenderedPageBreak/>
         <w:t># Another example, suppose our app supports multiple languages then set it as User Property so later we can answer:</w:t>
       </w:r>
     </w:p>
@@ -22512,7 +22576,6 @@
           <w:sz w:val="32"/>
           <w:szCs w:val="32"/>
         </w:rPr>
-        <w:lastRenderedPageBreak/>
         <w:t xml:space="preserve">await </w:t>
       </w:r>
       <w:proofErr w:type="spellStart"/>
@@ -23044,6 +23107,7 @@
           <w:sz w:val="32"/>
           <w:szCs w:val="32"/>
         </w:rPr>
+        <w:lastRenderedPageBreak/>
         <w:t>Theme</w:t>
       </w:r>
     </w:p>
@@ -23149,7 +23213,6 @@
           <w:sz w:val="32"/>
           <w:szCs w:val="32"/>
         </w:rPr>
-        <w:lastRenderedPageBreak/>
         <w:t>Region (if our app defines regions)</w:t>
       </w:r>
     </w:p>
@@ -23818,15 +23881,7 @@
           <w:sz w:val="32"/>
           <w:szCs w:val="32"/>
         </w:rPr>
-        <w:t xml:space="preserve">of events. To process that volume efficiently, most reports are not </w:t>
-      </w:r>
-      <w:r>
-        <w:rPr>
-          <w:sz w:val="32"/>
-          <w:szCs w:val="32"/>
-        </w:rPr>
-        <w:lastRenderedPageBreak/>
-        <w:t>updated instantly. Standard reports can take from several minutes to many hours to fully reflect new data.</w:t>
+        <w:t>of events. To process that volume efficiently, most reports are not updated instantly. Standard reports can take from several minutes to many hours to fully reflect new data.</w:t>
       </w:r>
     </w:p>
     <w:p>
@@ -24249,7 +24304,6 @@
           <w:sz w:val="32"/>
           <w:szCs w:val="32"/>
         </w:rPr>
-        <w:lastRenderedPageBreak/>
         <w:t xml:space="preserve">await </w:t>
       </w:r>
       <w:proofErr w:type="spellStart"/>
@@ -24707,6 +24761,7 @@
           <w:sz w:val="32"/>
           <w:szCs w:val="32"/>
         </w:rPr>
+        <w:lastRenderedPageBreak/>
         <w:t xml:space="preserve"># </w:t>
       </w:r>
       <w:r>
@@ -24840,7 +24895,6 @@
           <w:sz w:val="32"/>
           <w:szCs w:val="32"/>
         </w:rPr>
-        <w:lastRenderedPageBreak/>
         <w:t>);</w:t>
       </w:r>
     </w:p>
@@ -25476,6 +25530,7 @@
           <w:sz w:val="32"/>
           <w:szCs w:val="32"/>
         </w:rPr>
+        <w:lastRenderedPageBreak/>
         <w:t>#</w:t>
       </w:r>
       <w:r>
@@ -25625,7 +25680,6 @@
           <w:sz w:val="32"/>
           <w:szCs w:val="32"/>
         </w:rPr>
-        <w:lastRenderedPageBreak/>
         <w:t>project_name</w:t>
       </w:r>
       <w:proofErr w:type="spellEnd"/>
@@ -26256,7 +26310,6 @@
           <w:sz w:val="32"/>
           <w:szCs w:val="32"/>
         </w:rPr>
-        <w:lastRenderedPageBreak/>
         <w:t xml:space="preserve"># </w:t>
       </w:r>
       <w:r>
@@ -26733,6 +26786,7 @@
           <w:sz w:val="32"/>
           <w:szCs w:val="32"/>
         </w:rPr>
+        <w:lastRenderedPageBreak/>
         <w:t xml:space="preserve"># </w:t>
       </w:r>
       <w:r>
@@ -26865,7 +26919,6 @@
                 <w:sz w:val="32"/>
                 <w:szCs w:val="32"/>
               </w:rPr>
-              <w:lastRenderedPageBreak/>
               <w:t>Google Search</w:t>
             </w:r>
           </w:p>
@@ -27671,7 +27724,6 @@
           <w:sz w:val="28"/>
           <w:szCs w:val="28"/>
         </w:rPr>
-        <w:lastRenderedPageBreak/>
         <w:t>United States</w:t>
       </w:r>
     </w:p>
@@ -28142,6 +28194,7 @@
           <w:sz w:val="28"/>
           <w:szCs w:val="28"/>
         </w:rPr>
+        <w:lastRenderedPageBreak/>
         <w:t>Firefox</w:t>
       </w:r>
     </w:p>
@@ -28195,15 +28248,7 @@
           <w:sz w:val="32"/>
           <w:szCs w:val="32"/>
         </w:rPr>
-        <w:t xml:space="preserve"> notice that 80% of visitors use </w:t>
-      </w:r>
-      <w:r>
-        <w:rPr>
-          <w:sz w:val="32"/>
-          <w:szCs w:val="32"/>
-        </w:rPr>
-        <w:lastRenderedPageBreak/>
-        <w:t xml:space="preserve">Chrome, </w:t>
+        <w:t xml:space="preserve"> notice that 80% of visitors use Chrome, </w:t>
       </w:r>
       <w:r>
         <w:rPr>
@@ -28696,6 +28741,7 @@
           <w:sz w:val="28"/>
           <w:szCs w:val="28"/>
         </w:rPr>
+        <w:lastRenderedPageBreak/>
         <w:t>Project B</w:t>
       </w:r>
     </w:p>
@@ -28732,7 +28778,6 @@
           <w:sz w:val="32"/>
           <w:szCs w:val="32"/>
         </w:rPr>
-        <w:lastRenderedPageBreak/>
         <w:t># It tells m</w:t>
       </w:r>
       <w:r>
@@ -29167,6 +29212,7 @@
           <w:sz w:val="32"/>
           <w:szCs w:val="32"/>
         </w:rPr>
+        <w:lastRenderedPageBreak/>
         <w:t>Is the button easy to find?</w:t>
       </w:r>
     </w:p>
@@ -29209,7 +29255,6 @@
           <w:sz w:val="32"/>
           <w:szCs w:val="32"/>
         </w:rPr>
-        <w:lastRenderedPageBreak/>
         <w:t>Does it stand out visually?</w:t>
       </w:r>
     </w:p>
@@ -29644,6 +29689,7 @@
           <w:sz w:val="32"/>
           <w:szCs w:val="32"/>
         </w:rPr>
+        <w:lastRenderedPageBreak/>
         <w:t xml:space="preserve"># </w:t>
       </w:r>
       <w:r>
@@ -36225,6 +36271,7 @@
   <w:style w:type="character" w:default="1" w:styleId="DefaultParagraphFont">
     <w:name w:val="Default Paragraph Font"/>
     <w:uiPriority w:val="1"/>
+    <w:semiHidden/>
     <w:unhideWhenUsed/>
   </w:style>
   <w:style w:type="table" w:default="1" w:styleId="TableNormal">

</xml_diff>